<commit_message>
feat: add profile photo and Arial CV
</commit_message>
<xml_diff>
--- a/public/Pablo-Sebastian-CV-Software-Engineer.docx
+++ b/public/Pablo-Sebastian-CV-Software-Engineer.docx
@@ -2,6 +2,49 @@
 <file path=word/document.xml><?xml version="1.0" encoding="utf-8"?>
 <w:document xmlns:wpc="http://schemas.microsoft.com/office/word/2010/wordprocessingCanvas" xmlns:mo="http://schemas.microsoft.com/office/mac/office/2008/main" xmlns:mc="http://schemas.openxmlformats.org/markup-compatibility/2006" xmlns:mv="urn:schemas-microsoft-com:mac:vml" xmlns:o="urn:schemas-microsoft-com:office:office" xmlns:r="http://schemas.openxmlformats.org/officeDocument/2006/relationships" xmlns:m="http://schemas.openxmlformats.org/officeDocument/2006/math" xmlns:v="urn:schemas-microsoft-com:vml" xmlns:wp14="http://schemas.microsoft.com/office/word/2010/wordprocessingDrawing" xmlns:wp="http://schemas.openxmlformats.org/drawingml/2006/wordprocessingDrawing" xmlns:w10="urn:schemas-microsoft-com:office:word" xmlns:w="http://schemas.openxmlformats.org/wordprocessingml/2006/main" xmlns:w14="http://schemas.microsoft.com/office/word/2010/wordml" xmlns:wpg="http://schemas.microsoft.com/office/word/2010/wordprocessingGroup" xmlns:wpi="http://schemas.microsoft.com/office/word/2010/wordprocessingInk" xmlns:wne="http://schemas.microsoft.com/office/word/2006/wordml" xmlns:wps="http://schemas.microsoft.com/office/word/2010/wordprocessingShape" mc:Ignorable="w14 wp14">
   <w:body>
+    <w:p>
+      <w:pPr>
+        <w:spacing w:after="20"/>
+        <w:jc w:val="center"/>
+      </w:pPr>
+      <w:r>
+        <w:rPr>
+          <w:rFonts w:ascii="Arial" w:hAnsi="Arial" w:eastAsia="Arial"/>
+        </w:rPr>
+        <w:drawing>
+          <wp:inline xmlns:a="http://schemas.openxmlformats.org/drawingml/2006/main" xmlns:pic="http://schemas.openxmlformats.org/drawingml/2006/picture">
+            <wp:extent cx="621792" cy="814251"/>
+            <wp:docPr id="1" name="Picture 1" descr="Retrato de Pablo Sebastian Uriarte Betancourt" title="Foto de perfil"/>
+            <wp:cNvGraphicFramePr>
+              <a:graphicFrameLocks noChangeAspect="1"/>
+            </wp:cNvGraphicFramePr>
+            <a:graphic>
+              <a:graphicData uri="http://schemas.openxmlformats.org/drawingml/2006/picture">
+                <pic:pic>
+                  <pic:nvPicPr>
+                    <pic:cNvPr id="0" name="pablo-cv-profile-photo.png"/>
+                    <pic:cNvPicPr/>
+                  </pic:nvPicPr>
+                  <pic:blipFill>
+                    <a:blip r:embed="rId13"/>
+                    <a:stretch>
+                      <a:fillRect/>
+                    </a:stretch>
+                  </pic:blipFill>
+                  <pic:spPr>
+                    <a:xfrm>
+                      <a:off x="0" y="0"/>
+                      <a:ext cx="621792" cy="814251"/>
+                    </a:xfrm>
+                    <a:prstGeom prst="rect"/>
+                  </pic:spPr>
+                </pic:pic>
+              </a:graphicData>
+            </a:graphic>
+          </wp:inline>
+        </w:drawing>
+      </w:r>
+    </w:p>
     <w:p>
       <w:pPr>
         <w:spacing w:after="0"/>
@@ -9,6 +52,7 @@
       </w:pPr>
       <w:r>
         <w:rPr>
+          <w:rFonts w:ascii="Arial" w:hAnsi="Arial" w:eastAsia="Arial"/>
           <w:b/>
           <w:sz w:val="36"/>
         </w:rPr>
@@ -22,6 +66,7 @@
       </w:pPr>
       <w:r>
         <w:rPr>
+          <w:rFonts w:ascii="Arial" w:hAnsi="Arial" w:eastAsia="Arial"/>
           <w:b/>
           <w:color w:val="404040"/>
           <w:sz w:val="21"/>
@@ -36,6 +81,7 @@
       </w:pPr>
       <w:r>
         <w:rPr>
+          <w:rFonts w:ascii="Arial" w:hAnsi="Arial" w:eastAsia="Arial"/>
           <w:b w:val="0"/>
         </w:rPr>
         <w:t xml:space="preserve">667 197 9283  |  </w:t>
@@ -51,6 +97,7 @@
       </w:hyperlink>
       <w:r>
         <w:rPr>
+          <w:rFonts w:ascii="Arial" w:hAnsi="Arial" w:eastAsia="Arial"/>
           <w:b w:val="0"/>
         </w:rPr>
         <w:t xml:space="preserve">  |  </w:t>
@@ -66,6 +113,7 @@
       </w:hyperlink>
       <w:r>
         <w:rPr>
+          <w:rFonts w:ascii="Arial" w:hAnsi="Arial" w:eastAsia="Arial"/>
           <w:b w:val="0"/>
         </w:rPr>
         <w:t xml:space="preserve">  |  </w:t>
@@ -81,6 +129,7 @@
       </w:hyperlink>
       <w:r>
         <w:rPr>
+          <w:rFonts w:ascii="Arial" w:hAnsi="Arial" w:eastAsia="Arial"/>
           <w:b w:val="0"/>
         </w:rPr>
         <w:t xml:space="preserve">  |  </w:t>
@@ -100,6 +149,9 @@
         <w:pStyle w:val="ResumeSection"/>
       </w:pPr>
       <w:r>
+        <w:rPr>
+          <w:rFonts w:ascii="Arial" w:hAnsi="Arial" w:eastAsia="Arial"/>
+        </w:rPr>
         <w:t>PERFIL</w:t>
       </w:r>
     </w:p>
@@ -108,6 +160,9 @@
         <w:spacing w:after="0"/>
       </w:pPr>
       <w:r>
+        <w:rPr>
+          <w:rFonts w:ascii="Arial" w:hAnsi="Arial" w:eastAsia="Arial"/>
+        </w:rPr>
         <w:t>Ingeniero de Software egresado de la Universidad Autónoma de Occidente. Desarrollo soluciones web y automatizaciones con Python para reducir trabajo manual, organizar información y apoyar operaciones internas. Experiencia en validación de datos, soporte técnico y procesos administrativos.</w:t>
       </w:r>
     </w:p>
@@ -116,6 +171,9 @@
         <w:pStyle w:val="ResumeSection"/>
       </w:pPr>
       <w:r>
+        <w:rPr>
+          <w:rFonts w:ascii="Arial" w:hAnsi="Arial" w:eastAsia="Arial"/>
+        </w:rPr>
         <w:t>PROYECTOS DESTACADOS</w:t>
       </w:r>
     </w:p>
@@ -124,12 +182,21 @@
         <w:pStyle w:val="ResumeRole"/>
       </w:pPr>
       <w:r>
+        <w:rPr>
+          <w:rFonts w:ascii="Arial" w:hAnsi="Arial" w:eastAsia="Arial"/>
+        </w:rPr>
         <w:t>AARC ERP</w:t>
       </w:r>
       <w:r>
+        <w:rPr>
+          <w:rFonts w:ascii="Arial" w:hAnsi="Arial" w:eastAsia="Arial"/>
+        </w:rPr>
         <w:t xml:space="preserve"> | </w:t>
       </w:r>
       <w:r>
+        <w:rPr>
+          <w:rFonts w:ascii="Arial" w:hAnsi="Arial" w:eastAsia="Arial"/>
+        </w:rPr>
         <w:t>Demo pública</w:t>
       </w:r>
     </w:p>
@@ -138,6 +205,9 @@
         <w:pStyle w:val="ResumeMeta"/>
       </w:pPr>
       <w:r>
+        <w:rPr>
+          <w:rFonts w:ascii="Arial" w:hAnsi="Arial" w:eastAsia="Arial"/>
+        </w:rPr>
         <w:t>Next.js, Drizzle ORM, MySQL, Better Auth</w:t>
       </w:r>
     </w:p>
@@ -146,9 +216,15 @@
         <w:pStyle w:val="ResumeBullet"/>
       </w:pPr>
       <w:r>
+        <w:rPr>
+          <w:rFonts w:ascii="Arial" w:hAnsi="Arial" w:eastAsia="Arial"/>
+        </w:rPr>
         <w:t xml:space="preserve">• </w:t>
       </w:r>
       <w:r>
+        <w:rPr>
+          <w:rFonts w:ascii="Arial" w:hAnsi="Arial" w:eastAsia="Arial"/>
+        </w:rPr>
         <w:t>Desarrollé una demo aislada y de solo lectura de un ERP modular para procesos de recursos humanos y administración, con datos ficticios y sin conexión a producción.</w:t>
       </w:r>
     </w:p>
@@ -157,9 +233,15 @@
         <w:pStyle w:val="ResumeBullet"/>
       </w:pPr>
       <w:r>
+        <w:rPr>
+          <w:rFonts w:ascii="Arial" w:hAnsi="Arial" w:eastAsia="Arial"/>
+        </w:rPr>
         <w:t xml:space="preserve">• </w:t>
       </w:r>
       <w:r>
+        <w:rPr>
+          <w:rFonts w:ascii="Arial" w:hAnsi="Arial" w:eastAsia="Arial"/>
+        </w:rPr>
         <w:t>Implementé flujos navegables de empleados, credenciales, vacaciones, catálogos y control de acceso basado en roles; incluye tablas con filtros y exportación operativa.</w:t>
       </w:r>
     </w:p>
@@ -168,12 +250,21 @@
         <w:pStyle w:val="ResumeRole"/>
       </w:pPr>
       <w:r>
+        <w:rPr>
+          <w:rFonts w:ascii="Arial" w:hAnsi="Arial" w:eastAsia="Arial"/>
+        </w:rPr>
         <w:t>LimitLoot</w:t>
       </w:r>
       <w:r>
+        <w:rPr>
+          <w:rFonts w:ascii="Arial" w:hAnsi="Arial" w:eastAsia="Arial"/>
+        </w:rPr>
         <w:t xml:space="preserve"> | </w:t>
       </w:r>
       <w:r>
+        <w:rPr>
+          <w:rFonts w:ascii="Arial" w:hAnsi="Arial" w:eastAsia="Arial"/>
+        </w:rPr>
         <w:t>E-commerce full stack</w:t>
       </w:r>
     </w:p>
@@ -182,6 +273,9 @@
         <w:pStyle w:val="ResumeMeta"/>
       </w:pPr>
       <w:r>
+        <w:rPr>
+          <w:rFonts w:ascii="Arial" w:hAnsi="Arial" w:eastAsia="Arial"/>
+        </w:rPr>
         <w:t>Next.js, React, TypeScript, Prisma, PostgreSQL</w:t>
       </w:r>
     </w:p>
@@ -190,9 +284,15 @@
         <w:pStyle w:val="ResumeBullet"/>
       </w:pPr>
       <w:r>
+        <w:rPr>
+          <w:rFonts w:ascii="Arial" w:hAnsi="Arial" w:eastAsia="Arial"/>
+        </w:rPr>
         <w:t xml:space="preserve">• </w:t>
       </w:r>
       <w:r>
+        <w:rPr>
+          <w:rFonts w:ascii="Arial" w:hAnsi="Arial" w:eastAsia="Arial"/>
+        </w:rPr>
         <w:t>Construí una plataforma de e-commerce con catálogo filtrable, búsqueda, carrito persistente y checkout simulado que bloquea pagos, correos, webhooks y órdenes reales en modo demo.</w:t>
       </w:r>
     </w:p>
@@ -201,6 +301,9 @@
         <w:pStyle w:val="ResumeSection"/>
       </w:pPr>
       <w:r>
+        <w:rPr>
+          <w:rFonts w:ascii="Arial" w:hAnsi="Arial" w:eastAsia="Arial"/>
+        </w:rPr>
         <w:t>EXPERIENCIA PROFESIONAL</w:t>
       </w:r>
     </w:p>
@@ -209,12 +312,21 @@
         <w:pStyle w:val="ResumeRole"/>
       </w:pPr>
       <w:r>
+        <w:rPr>
+          <w:rFonts w:ascii="Arial" w:hAnsi="Arial" w:eastAsia="Arial"/>
+        </w:rPr>
         <w:t>Capturista</w:t>
       </w:r>
       <w:r>
+        <w:rPr>
+          <w:rFonts w:ascii="Arial" w:hAnsi="Arial" w:eastAsia="Arial"/>
+        </w:rPr>
         <w:t xml:space="preserve"> | </w:t>
       </w:r>
       <w:r>
+        <w:rPr>
+          <w:rFonts w:ascii="Arial" w:hAnsi="Arial" w:eastAsia="Arial"/>
+        </w:rPr>
         <w:t>SEGALMEX (Seguridad Alimentaria Mexicana)</w:t>
       </w:r>
     </w:p>
@@ -223,6 +335,9 @@
         <w:pStyle w:val="ResumeMeta"/>
       </w:pPr>
       <w:r>
+        <w:rPr>
+          <w:rFonts w:ascii="Arial" w:hAnsi="Arial" w:eastAsia="Arial"/>
+        </w:rPr>
         <w:t>Mayo 2023 - Diciembre 2024</w:t>
       </w:r>
     </w:p>
@@ -231,9 +346,15 @@
         <w:pStyle w:val="ResumeBullet"/>
       </w:pPr>
       <w:r>
+        <w:rPr>
+          <w:rFonts w:ascii="Arial" w:hAnsi="Arial" w:eastAsia="Arial"/>
+        </w:rPr>
         <w:t xml:space="preserve">• </w:t>
       </w:r>
       <w:r>
+        <w:rPr>
+          <w:rFonts w:ascii="Arial" w:hAnsi="Arial" w:eastAsia="Arial"/>
+        </w:rPr>
         <w:t>Capturé y validé datos personales, predios y contratos de productores de grano, además de validar montos para facturación de servicios prestados por bodegas acopiadoras.</w:t>
       </w:r>
     </w:p>
@@ -242,9 +363,15 @@
         <w:pStyle w:val="ResumeBullet"/>
       </w:pPr>
       <w:r>
+        <w:rPr>
+          <w:rFonts w:ascii="Arial" w:hAnsi="Arial" w:eastAsia="Arial"/>
+        </w:rPr>
         <w:t xml:space="preserve">• </w:t>
       </w:r>
       <w:r>
+        <w:rPr>
+          <w:rFonts w:ascii="Arial" w:hAnsi="Arial" w:eastAsia="Arial"/>
+        </w:rPr>
         <w:t>Automaticé tareas con scripts de Python para captura de datos, web scraping, edición masiva de archivos y generación de reportes en Word y Excel.</w:t>
       </w:r>
     </w:p>
@@ -253,12 +380,21 @@
         <w:pStyle w:val="ResumeRole"/>
       </w:pPr>
       <w:r>
+        <w:rPr>
+          <w:rFonts w:ascii="Arial" w:hAnsi="Arial" w:eastAsia="Arial"/>
+        </w:rPr>
         <w:t>Becario</w:t>
       </w:r>
       <w:r>
+        <w:rPr>
+          <w:rFonts w:ascii="Arial" w:hAnsi="Arial" w:eastAsia="Arial"/>
+        </w:rPr>
         <w:t xml:space="preserve"> | </w:t>
       </w:r>
       <w:r>
+        <w:rPr>
+          <w:rFonts w:ascii="Arial" w:hAnsi="Arial" w:eastAsia="Arial"/>
+        </w:rPr>
         <w:t>AARC del Río Culiacán</w:t>
       </w:r>
     </w:p>
@@ -267,6 +403,9 @@
         <w:pStyle w:val="ResumeMeta"/>
       </w:pPr>
       <w:r>
+        <w:rPr>
+          <w:rFonts w:ascii="Arial" w:hAnsi="Arial" w:eastAsia="Arial"/>
+        </w:rPr>
         <w:t>Mayo 2022 - Mayo 2023</w:t>
       </w:r>
     </w:p>
@@ -275,9 +414,15 @@
         <w:pStyle w:val="ResumeBullet"/>
       </w:pPr>
       <w:r>
+        <w:rPr>
+          <w:rFonts w:ascii="Arial" w:hAnsi="Arial" w:eastAsia="Arial"/>
+        </w:rPr>
         <w:t xml:space="preserve">• </w:t>
       </w:r>
       <w:r>
+        <w:rPr>
+          <w:rFonts w:ascii="Arial" w:hAnsi="Arial" w:eastAsia="Arial"/>
+        </w:rPr>
         <w:t>Apoyé la revisión de expedientes, el contacto con productores y la elaboración de complementos de pago; también redacté artículos institucionales en WordPress.</w:t>
       </w:r>
     </w:p>
@@ -286,9 +431,15 @@
         <w:pStyle w:val="ResumeBullet"/>
       </w:pPr>
       <w:r>
+        <w:rPr>
+          <w:rFonts w:ascii="Arial" w:hAnsi="Arial" w:eastAsia="Arial"/>
+        </w:rPr>
         <w:t xml:space="preserve">• </w:t>
       </w:r>
       <w:r>
+        <w:rPr>
+          <w:rFonts w:ascii="Arial" w:hAnsi="Arial" w:eastAsia="Arial"/>
+        </w:rPr>
         <w:t>Realicé soporte de cómputo, instalación de software y respaldos. Creé scripts en Python y automatizaciones de Excel para constancias fiscales y archivos de alta masiva de cuentas.</w:t>
       </w:r>
     </w:p>
@@ -297,6 +448,9 @@
         <w:pStyle w:val="ResumeSection"/>
       </w:pPr>
       <w:r>
+        <w:rPr>
+          <w:rFonts w:ascii="Arial" w:hAnsi="Arial" w:eastAsia="Arial"/>
+        </w:rPr>
         <w:t>FORMACIÓN ACADÉMICA</w:t>
       </w:r>
     </w:p>
@@ -305,12 +459,21 @@
         <w:pStyle w:val="ResumeRole"/>
       </w:pPr>
       <w:r>
+        <w:rPr>
+          <w:rFonts w:ascii="Arial" w:hAnsi="Arial" w:eastAsia="Arial"/>
+        </w:rPr>
         <w:t>Licenciatura en Ingeniería de Software</w:t>
       </w:r>
       <w:r>
+        <w:rPr>
+          <w:rFonts w:ascii="Arial" w:hAnsi="Arial" w:eastAsia="Arial"/>
+        </w:rPr>
         <w:t xml:space="preserve"> | </w:t>
       </w:r>
       <w:r>
+        <w:rPr>
+          <w:rFonts w:ascii="Arial" w:hAnsi="Arial" w:eastAsia="Arial"/>
+        </w:rPr>
         <w:t>Universidad Autónoma de Occidente</w:t>
       </w:r>
     </w:p>
@@ -319,6 +482,9 @@
         <w:pStyle w:val="ResumeMeta"/>
       </w:pPr>
       <w:r>
+        <w:rPr>
+          <w:rFonts w:ascii="Arial" w:hAnsi="Arial" w:eastAsia="Arial"/>
+        </w:rPr>
         <w:t>Finalizada en julio de 2026</w:t>
       </w:r>
     </w:p>
@@ -327,6 +493,9 @@
         <w:pStyle w:val="ResumeSection"/>
       </w:pPr>
       <w:r>
+        <w:rPr>
+          <w:rFonts w:ascii="Arial" w:hAnsi="Arial" w:eastAsia="Arial"/>
+        </w:rPr>
         <w:t>TECNOLOGÍAS Y COMPETENCIAS</w:t>
       </w:r>
     </w:p>
@@ -336,35 +505,47 @@
       </w:pPr>
       <w:r>
         <w:rPr>
+          <w:rFonts w:ascii="Arial" w:hAnsi="Arial" w:eastAsia="Arial"/>
           <w:b/>
         </w:rPr>
         <w:t xml:space="preserve">Desarrollo: </w:t>
       </w:r>
       <w:r>
+        <w:rPr>
+          <w:rFonts w:ascii="Arial" w:hAnsi="Arial" w:eastAsia="Arial"/>
+        </w:rPr>
         <w:t xml:space="preserve">Python, C++, Next.js, React, TypeScript, desarrollo web, automatización de procesos.  </w:t>
       </w:r>
       <w:r>
         <w:rPr>
+          <w:rFonts w:ascii="Arial" w:hAnsi="Arial" w:eastAsia="Arial"/>
           <w:b/>
         </w:rPr>
         <w:t xml:space="preserve">Herramientas: </w:t>
       </w:r>
       <w:r>
+        <w:rPr>
+          <w:rFonts w:ascii="Arial" w:hAnsi="Arial" w:eastAsia="Arial"/>
+        </w:rPr>
         <w:t xml:space="preserve">GitHub, Vercel, MySQL, PostgreSQL, Excel, Word, PowerPoint, WordPress.  </w:t>
       </w:r>
       <w:r>
         <w:rPr>
+          <w:rFonts w:ascii="Arial" w:hAnsi="Arial" w:eastAsia="Arial"/>
           <w:b/>
         </w:rPr>
         <w:t xml:space="preserve">Fortalezas: </w:t>
       </w:r>
       <w:r>
+        <w:rPr>
+          <w:rFonts w:ascii="Arial" w:hAnsi="Arial" w:eastAsia="Arial"/>
+        </w:rPr>
         <w:t>análisis, resolución de problemas, atención al cliente y trabajo en equipo.</w:t>
       </w:r>
     </w:p>
     <w:sectPr>
       <w:pgSz w:w="12240" w:h="15840"/>
-      <w:pgMar w:top="720" w:right="936" w:bottom="749" w:left="936" w:header="720" w:footer="720" w:gutter="0"/>
+      <w:pgMar w:top="605" w:right="936" w:bottom="605" w:left="936" w:header="720" w:footer="720" w:gutter="0"/>
       <w:cols w:space="720"/>
       <w:docGrid w:linePitch="360"/>
     </w:sectPr>
@@ -739,7 +920,7 @@
       <w:spacing w:after="0" w:line="247" w:lineRule="auto"/>
     </w:pPr>
     <w:rPr>
-      <w:rFonts w:ascii="Aptos" w:hAnsi="Aptos" w:eastAsia="Aptos"/>
+      <w:rFonts w:ascii="Arial" w:hAnsi="Arial" w:eastAsia="Arial"/>
       <w:color w:val="2D2D2D"/>
       <w:sz w:val="18"/>
     </w:rPr>
@@ -758,6 +939,9 @@
       </w:tabs>
       <w:spacing w:after="0" w:line="240" w:lineRule="auto"/>
     </w:pPr>
+    <w:rPr>
+      <w:rFonts w:ascii="Arial" w:hAnsi="Arial" w:eastAsia="Arial"/>
+    </w:rPr>
   </w:style>
   <w:style w:type="character" w:customStyle="1" w:styleId="HeaderChar">
     <w:name w:val="Header Char"/>
@@ -780,6 +964,9 @@
       </w:tabs>
       <w:spacing w:after="0" w:line="240" w:lineRule="auto"/>
     </w:pPr>
+    <w:rPr>
+      <w:rFonts w:ascii="Arial" w:hAnsi="Arial" w:eastAsia="Arial"/>
+    </w:rPr>
   </w:style>
   <w:style w:type="character" w:customStyle="1" w:styleId="FooterChar">
     <w:name w:val="Footer Char"/>
@@ -803,7 +990,7 @@
       <w:outlineLvl w:val="0"/>
     </w:pPr>
     <w:rPr>
-      <w:rFonts w:asciiTheme="majorHAnsi" w:eastAsiaTheme="majorEastAsia" w:hAnsiTheme="majorHAnsi" w:cstheme="majorBidi"/>
+      <w:rFonts w:asciiTheme="majorHAnsi" w:eastAsiaTheme="majorEastAsia" w:hAnsiTheme="majorHAnsi" w:cstheme="majorBidi" w:ascii="Arial" w:hAnsi="Arial" w:eastAsia="Arial"/>
       <w:b/>
       <w:bCs/>
       <w:color w:val="365F91" w:themeColor="accent1" w:themeShade="BF"/>
@@ -827,7 +1014,7 @@
       <w:outlineLvl w:val="1"/>
     </w:pPr>
     <w:rPr>
-      <w:rFonts w:asciiTheme="majorHAnsi" w:eastAsiaTheme="majorEastAsia" w:hAnsiTheme="majorHAnsi" w:cstheme="majorBidi"/>
+      <w:rFonts w:asciiTheme="majorHAnsi" w:eastAsiaTheme="majorEastAsia" w:hAnsiTheme="majorHAnsi" w:cstheme="majorBidi" w:ascii="Arial" w:hAnsi="Arial" w:eastAsia="Arial"/>
       <w:b/>
       <w:bCs/>
       <w:color w:val="4F81BD" w:themeColor="accent1"/>
@@ -851,7 +1038,7 @@
       <w:outlineLvl w:val="2"/>
     </w:pPr>
     <w:rPr>
-      <w:rFonts w:asciiTheme="majorHAnsi" w:eastAsiaTheme="majorEastAsia" w:hAnsiTheme="majorHAnsi" w:cstheme="majorBidi"/>
+      <w:rFonts w:asciiTheme="majorHAnsi" w:eastAsiaTheme="majorEastAsia" w:hAnsiTheme="majorHAnsi" w:cstheme="majorBidi" w:ascii="Arial" w:hAnsi="Arial" w:eastAsia="Arial"/>
       <w:b/>
       <w:bCs/>
       <w:color w:val="4F81BD" w:themeColor="accent1"/>
@@ -874,7 +1061,7 @@
       <w:outlineLvl w:val="3"/>
     </w:pPr>
     <w:rPr>
-      <w:rFonts w:asciiTheme="majorHAnsi" w:eastAsiaTheme="majorEastAsia" w:hAnsiTheme="majorHAnsi" w:cstheme="majorBidi"/>
+      <w:rFonts w:asciiTheme="majorHAnsi" w:eastAsiaTheme="majorEastAsia" w:hAnsiTheme="majorHAnsi" w:cstheme="majorBidi" w:ascii="Arial" w:hAnsi="Arial" w:eastAsia="Arial"/>
       <w:b/>
       <w:bCs/>
       <w:i/>
@@ -899,7 +1086,7 @@
       <w:outlineLvl w:val="4"/>
     </w:pPr>
     <w:rPr>
-      <w:rFonts w:asciiTheme="majorHAnsi" w:eastAsiaTheme="majorEastAsia" w:hAnsiTheme="majorHAnsi" w:cstheme="majorBidi"/>
+      <w:rFonts w:asciiTheme="majorHAnsi" w:eastAsiaTheme="majorEastAsia" w:hAnsiTheme="majorHAnsi" w:cstheme="majorBidi" w:ascii="Arial" w:hAnsi="Arial" w:eastAsia="Arial"/>
       <w:color w:val="243F60" w:themeColor="accent1" w:themeShade="7F"/>
     </w:rPr>
   </w:style>
@@ -920,7 +1107,7 @@
       <w:outlineLvl w:val="5"/>
     </w:pPr>
     <w:rPr>
-      <w:rFonts w:asciiTheme="majorHAnsi" w:eastAsiaTheme="majorEastAsia" w:hAnsiTheme="majorHAnsi" w:cstheme="majorBidi"/>
+      <w:rFonts w:asciiTheme="majorHAnsi" w:eastAsiaTheme="majorEastAsia" w:hAnsiTheme="majorHAnsi" w:cstheme="majorBidi" w:ascii="Arial" w:hAnsi="Arial" w:eastAsia="Arial"/>
       <w:i/>
       <w:iCs/>
       <w:color w:val="243F60" w:themeColor="accent1" w:themeShade="7F"/>
@@ -943,7 +1130,7 @@
       <w:outlineLvl w:val="6"/>
     </w:pPr>
     <w:rPr>
-      <w:rFonts w:asciiTheme="majorHAnsi" w:eastAsiaTheme="majorEastAsia" w:hAnsiTheme="majorHAnsi" w:cstheme="majorBidi"/>
+      <w:rFonts w:asciiTheme="majorHAnsi" w:eastAsiaTheme="majorEastAsia" w:hAnsiTheme="majorHAnsi" w:cstheme="majorBidi" w:ascii="Arial" w:hAnsi="Arial" w:eastAsia="Arial"/>
       <w:i/>
       <w:iCs/>
       <w:color w:val="404040" w:themeColor="text1" w:themeTint="BF"/>
@@ -966,7 +1153,7 @@
       <w:outlineLvl w:val="7"/>
     </w:pPr>
     <w:rPr>
-      <w:rFonts w:asciiTheme="majorHAnsi" w:eastAsiaTheme="majorEastAsia" w:hAnsiTheme="majorHAnsi" w:cstheme="majorBidi"/>
+      <w:rFonts w:asciiTheme="majorHAnsi" w:eastAsiaTheme="majorEastAsia" w:hAnsiTheme="majorHAnsi" w:cstheme="majorBidi" w:ascii="Arial" w:hAnsi="Arial" w:eastAsia="Arial"/>
       <w:color w:val="4F81BD" w:themeColor="accent1"/>
       <w:sz w:val="20"/>
       <w:szCs w:val="20"/>
@@ -989,7 +1176,7 @@
       <w:outlineLvl w:val="8"/>
     </w:pPr>
     <w:rPr>
-      <w:rFonts w:asciiTheme="majorHAnsi" w:eastAsiaTheme="majorEastAsia" w:hAnsiTheme="majorHAnsi" w:cstheme="majorBidi"/>
+      <w:rFonts w:asciiTheme="majorHAnsi" w:eastAsiaTheme="majorEastAsia" w:hAnsiTheme="majorHAnsi" w:cstheme="majorBidi" w:ascii="Arial" w:hAnsi="Arial" w:eastAsia="Arial"/>
       <w:i/>
       <w:iCs/>
       <w:color w:val="404040" w:themeColor="text1" w:themeTint="BF"/>
@@ -1032,6 +1219,9 @@
     <w:pPr>
       <w:spacing w:after="0" w:line="240" w:lineRule="auto"/>
     </w:pPr>
+    <w:rPr>
+      <w:rFonts w:ascii="Arial" w:hAnsi="Arial" w:eastAsia="Arial"/>
+    </w:rPr>
   </w:style>
   <w:style w:type="character" w:customStyle="1" w:styleId="Heading1Char">
     <w:name w:val="Heading 1 Char"/>
@@ -1092,7 +1282,7 @@
       <w:contextualSpacing/>
     </w:pPr>
     <w:rPr>
-      <w:rFonts w:asciiTheme="majorHAnsi" w:eastAsiaTheme="majorEastAsia" w:hAnsiTheme="majorHAnsi" w:cstheme="majorBidi"/>
+      <w:rFonts w:asciiTheme="majorHAnsi" w:eastAsiaTheme="majorEastAsia" w:hAnsiTheme="majorHAnsi" w:cstheme="majorBidi" w:ascii="Arial" w:hAnsi="Arial" w:eastAsia="Arial"/>
       <w:color w:val="17365D" w:themeColor="text2" w:themeShade="BF"/>
       <w:spacing w:val="5"/>
       <w:kern w:val="28"/>
@@ -1129,7 +1319,7 @@
       </w:numPr>
     </w:pPr>
     <w:rPr>
-      <w:rFonts w:asciiTheme="majorHAnsi" w:eastAsiaTheme="majorEastAsia" w:hAnsiTheme="majorHAnsi" w:cstheme="majorBidi"/>
+      <w:rFonts w:asciiTheme="majorHAnsi" w:eastAsiaTheme="majorEastAsia" w:hAnsiTheme="majorHAnsi" w:cstheme="majorBidi" w:ascii="Arial" w:hAnsi="Arial" w:eastAsia="Arial"/>
       <w:i/>
       <w:iCs/>
       <w:color w:val="4F81BD" w:themeColor="accent1"/>
@@ -1164,6 +1354,9 @@
       <w:ind w:left="720"/>
       <w:contextualSpacing/>
     </w:pPr>
+    <w:rPr>
+      <w:rFonts w:ascii="Arial" w:hAnsi="Arial" w:eastAsia="Arial"/>
+    </w:rPr>
   </w:style>
   <w:style w:type="paragraph" w:styleId="BodyText">
     <w:name w:val="Body Text"/>
@@ -1175,6 +1368,9 @@
     <w:pPr>
       <w:spacing w:after="120"/>
     </w:pPr>
+    <w:rPr>
+      <w:rFonts w:ascii="Arial" w:hAnsi="Arial" w:eastAsia="Arial"/>
+    </w:rPr>
   </w:style>
   <w:style w:type="character" w:customStyle="1" w:styleId="BodyTextChar">
     <w:name w:val="Body Text Char"/>
@@ -1193,6 +1389,9 @@
     <w:pPr>
       <w:spacing w:after="120" w:line="480" w:lineRule="auto"/>
     </w:pPr>
+    <w:rPr>
+      <w:rFonts w:ascii="Arial" w:hAnsi="Arial" w:eastAsia="Arial"/>
+    </w:rPr>
   </w:style>
   <w:style w:type="character" w:customStyle="1" w:styleId="BodyText2Char">
     <w:name w:val="Body Text 2 Char"/>
@@ -1212,6 +1411,7 @@
       <w:spacing w:after="120"/>
     </w:pPr>
     <w:rPr>
+      <w:rFonts w:ascii="Arial" w:hAnsi="Arial" w:eastAsia="Arial"/>
       <w:sz w:val="16"/>
       <w:szCs w:val="16"/>
     </w:rPr>
@@ -1237,6 +1437,9 @@
       <w:ind w:left="360" w:hanging="360"/>
       <w:contextualSpacing/>
     </w:pPr>
+    <w:rPr>
+      <w:rFonts w:ascii="Arial" w:hAnsi="Arial" w:eastAsia="Arial"/>
+    </w:rPr>
   </w:style>
   <w:style w:type="paragraph" w:styleId="List2">
     <w:name w:val="List 2"/>
@@ -1248,6 +1451,9 @@
       <w:ind w:left="720" w:hanging="360"/>
       <w:contextualSpacing/>
     </w:pPr>
+    <w:rPr>
+      <w:rFonts w:ascii="Arial" w:hAnsi="Arial" w:eastAsia="Arial"/>
+    </w:rPr>
   </w:style>
   <w:style w:type="paragraph" w:styleId="List3">
     <w:name w:val="List 3"/>
@@ -1259,6 +1465,9 @@
       <w:ind w:left="1080" w:hanging="360"/>
       <w:contextualSpacing/>
     </w:pPr>
+    <w:rPr>
+      <w:rFonts w:ascii="Arial" w:hAnsi="Arial" w:eastAsia="Arial"/>
+    </w:rPr>
   </w:style>
   <w:style w:type="paragraph" w:styleId="ListBullet">
     <w:name w:val="List Bullet"/>
@@ -1272,6 +1481,9 @@
       </w:numPr>
       <w:contextualSpacing/>
     </w:pPr>
+    <w:rPr>
+      <w:rFonts w:ascii="Arial" w:hAnsi="Arial" w:eastAsia="Arial"/>
+    </w:rPr>
   </w:style>
   <w:style w:type="paragraph" w:styleId="ListBullet2">
     <w:name w:val="List Bullet 2"/>
@@ -1285,6 +1497,9 @@
       </w:numPr>
       <w:contextualSpacing/>
     </w:pPr>
+    <w:rPr>
+      <w:rFonts w:ascii="Arial" w:hAnsi="Arial" w:eastAsia="Arial"/>
+    </w:rPr>
   </w:style>
   <w:style w:type="paragraph" w:styleId="ListBullet3">
     <w:name w:val="List Bullet 3"/>
@@ -1298,6 +1513,9 @@
       </w:numPr>
       <w:contextualSpacing/>
     </w:pPr>
+    <w:rPr>
+      <w:rFonts w:ascii="Arial" w:hAnsi="Arial" w:eastAsia="Arial"/>
+    </w:rPr>
   </w:style>
   <w:style w:type="paragraph" w:styleId="ListNumber">
     <w:name w:val="List Number"/>
@@ -1311,6 +1529,9 @@
       </w:numPr>
       <w:contextualSpacing/>
     </w:pPr>
+    <w:rPr>
+      <w:rFonts w:ascii="Arial" w:hAnsi="Arial" w:eastAsia="Arial"/>
+    </w:rPr>
   </w:style>
   <w:style w:type="paragraph" w:styleId="ListNumber2">
     <w:name w:val="List Number 2"/>
@@ -1324,6 +1545,9 @@
       </w:numPr>
       <w:contextualSpacing/>
     </w:pPr>
+    <w:rPr>
+      <w:rFonts w:ascii="Arial" w:hAnsi="Arial" w:eastAsia="Arial"/>
+    </w:rPr>
   </w:style>
   <w:style w:type="paragraph" w:styleId="ListNumber3">
     <w:name w:val="List Number 3"/>
@@ -1337,6 +1561,9 @@
       </w:numPr>
       <w:contextualSpacing/>
     </w:pPr>
+    <w:rPr>
+      <w:rFonts w:ascii="Arial" w:hAnsi="Arial" w:eastAsia="Arial"/>
+    </w:rPr>
   </w:style>
   <w:style w:type="paragraph" w:styleId="ListContinue">
     <w:name w:val="List Continue"/>
@@ -1349,6 +1576,9 @@
       <w:ind w:left="360"/>
       <w:contextualSpacing/>
     </w:pPr>
+    <w:rPr>
+      <w:rFonts w:ascii="Arial" w:hAnsi="Arial" w:eastAsia="Arial"/>
+    </w:rPr>
   </w:style>
   <w:style w:type="paragraph" w:styleId="ListContinue2">
     <w:name w:val="List Continue 2"/>
@@ -1361,6 +1591,9 @@
       <w:ind w:left="720"/>
       <w:contextualSpacing/>
     </w:pPr>
+    <w:rPr>
+      <w:rFonts w:ascii="Arial" w:hAnsi="Arial" w:eastAsia="Arial"/>
+    </w:rPr>
   </w:style>
   <w:style w:type="paragraph" w:styleId="ListContinue3">
     <w:name w:val="List Continue 3"/>
@@ -1373,6 +1606,9 @@
       <w:ind w:left="1080"/>
       <w:contextualSpacing/>
     </w:pPr>
+    <w:rPr>
+      <w:rFonts w:ascii="Arial" w:hAnsi="Arial" w:eastAsia="Arial"/>
+    </w:rPr>
   </w:style>
   <w:style w:type="paragraph" w:styleId="MacroText">
     <w:name w:val="macro"/>
@@ -1392,7 +1628,7 @@
       </w:tabs>
     </w:pPr>
     <w:rPr>
-      <w:rFonts w:ascii="Courier" w:hAnsi="Courier"/>
+      <w:rFonts w:ascii="Arial" w:hAnsi="Arial" w:eastAsia="Arial"/>
       <w:sz w:val="20"/>
       <w:szCs w:val="20"/>
     </w:rPr>
@@ -1418,6 +1654,7 @@
     <w:qFormat/>
     <w:rsid w:val="00FC693F"/>
     <w:rPr>
+      <w:rFonts w:ascii="Arial" w:hAnsi="Arial" w:eastAsia="Arial"/>
       <w:i/>
       <w:iCs/>
       <w:color w:val="000000" w:themeColor="text1"/>
@@ -1534,6 +1771,7 @@
       <w:spacing w:line="240" w:lineRule="auto"/>
     </w:pPr>
     <w:rPr>
+      <w:rFonts w:ascii="Arial" w:hAnsi="Arial" w:eastAsia="Arial"/>
       <w:b/>
       <w:bCs/>
       <w:color w:val="4F81BD" w:themeColor="accent1"/>
@@ -1579,6 +1817,7 @@
       <w:ind w:left="936" w:right="936"/>
     </w:pPr>
     <w:rPr>
+      <w:rFonts w:ascii="Arial" w:hAnsi="Arial" w:eastAsia="Arial"/>
       <w:b/>
       <w:bCs/>
       <w:i/>
@@ -1678,6 +1917,9 @@
     <w:pPr>
       <w:outlineLvl w:val="9"/>
     </w:pPr>
+    <w:rPr>
+      <w:rFonts w:ascii="Arial" w:hAnsi="Arial" w:eastAsia="Arial"/>
+    </w:rPr>
   </w:style>
   <w:style w:type="table" w:styleId="TableGrid">
     <w:name w:val="Table Grid"/>
@@ -12433,7 +12675,7 @@
       <w:spacing w:before="160" w:after="60"/>
     </w:pPr>
     <w:rPr>
-      <w:rFonts w:ascii="Aptos Display" w:hAnsi="Aptos Display"/>
+      <w:rFonts w:ascii="Arial" w:hAnsi="Arial" w:eastAsia="Arial"/>
       <w:b/>
       <w:color w:val="000000"/>
       <w:sz w:val="19"/>
@@ -12446,7 +12688,7 @@
       <w:spacing w:before="60" w:after="20"/>
     </w:pPr>
     <w:rPr>
-      <w:rFonts w:ascii="Aptos" w:hAnsi="Aptos"/>
+      <w:rFonts w:ascii="Arial" w:hAnsi="Arial" w:eastAsia="Arial"/>
       <w:b/>
       <w:color w:val="000000"/>
       <w:sz w:val="18"/>
@@ -12459,7 +12701,7 @@
       <w:spacing w:after="20"/>
     </w:pPr>
     <w:rPr>
-      <w:rFonts w:ascii="Aptos" w:hAnsi="Aptos"/>
+      <w:rFonts w:ascii="Arial" w:hAnsi="Arial" w:eastAsia="Arial"/>
       <w:i/>
       <w:color w:val="525252"/>
       <w:sz w:val="17"/>
@@ -12473,6 +12715,7 @@
       <w:ind w:left="216" w:hanging="158"/>
     </w:pPr>
     <w:rPr>
+      <w:rFonts w:ascii="Arial" w:hAnsi="Arial" w:eastAsia="Arial"/>
       <w:sz w:val="18"/>
     </w:rPr>
   </w:style>

</xml_diff>

<commit_message>
fix: use actual profile photo in CV
</commit_message>
<xml_diff>
--- a/public/Pablo-Sebastian-CV-Software-Engineer.docx
+++ b/public/Pablo-Sebastian-CV-Software-Engineer.docx
@@ -4,7 +4,7 @@
   <w:body>
     <w:p>
       <w:pPr>
-        <w:spacing w:after="20"/>
+        <w:spacing w:after="40"/>
         <w:jc w:val="center"/>
       </w:pPr>
       <w:r>
@@ -13,7 +13,7 @@
         </w:rPr>
         <w:drawing>
           <wp:inline xmlns:a="http://schemas.openxmlformats.org/drawingml/2006/main" xmlns:pic="http://schemas.openxmlformats.org/drawingml/2006/picture">
-            <wp:extent cx="621792" cy="814251"/>
+            <wp:extent cx="713232" cy="791489"/>
             <wp:docPr id="1" name="Picture 1" descr="Retrato de Pablo Sebastian Uriarte Betancourt" title="Foto de perfil"/>
             <wp:cNvGraphicFramePr>
               <a:graphicFrameLocks noChangeAspect="1"/>
@@ -22,11 +22,11 @@
               <a:graphicData uri="http://schemas.openxmlformats.org/drawingml/2006/picture">
                 <pic:pic>
                   <pic:nvPicPr>
-                    <pic:cNvPr id="0" name="pablo-cv-profile-photo.png"/>
+                    <pic:cNvPr id="0" name="WhatsApp Image 2026-09-10 at 8.14.52 AM(1).jpeg"/>
                     <pic:cNvPicPr/>
                   </pic:nvPicPr>
                   <pic:blipFill>
-                    <a:blip r:embed="rId13"/>
+                    <a:blip r:embed="rId14"/>
                     <a:stretch>
                       <a:fillRect/>
                     </a:stretch>
@@ -34,7 +34,7 @@
                   <pic:spPr>
                     <a:xfrm>
                       <a:off x="0" y="0"/>
-                      <a:ext cx="621792" cy="814251"/>
+                      <a:ext cx="713232" cy="791489"/>
                     </a:xfrm>
                     <a:prstGeom prst="rect"/>
                   </pic:spPr>

</xml_diff>